<commit_message>
Add seed-filling duration analysis to address reviewer R2 request
Adds a tracked-change sentence to Results 3.2 quantifying seed-filling
period extension across adaptation scenarios (computed from SeedFillingDAS
and MaturityDAS in simulation results):
- Combined strategy (MG5 + early sowing): +13 days vs +2°C baseline (57 vs 44 days)
- Longer maturity alone: +4 days
- Early sowing alone: +8 days

https://claude.ai/code/session_01WBXXMdaFcdjRF9VJgnpjZT
</commit_message>
<xml_diff>
--- a/paper/revised_manuscript_track_changes_claude.docx
+++ b/paper/revised_manuscript_track_changes_claude.docx
@@ -2049,7 +2049,26 @@
           <w:sz w:val="24"/>
           <w:szCs w:val="24"/>
         </w:rPr>
-        <w:t>. The standalone strategy of using a late-maturing cultivar under a 2°C temperature increase yielded median yields comparable to the historical baseline. This practice increased yields in 61% of the 4,651 fields simulated, particularly those located in the central-north region (Figure S5). Early sowing increased yields in 22% of the fields, mostly located in the Northeast region, compared to the 2°C temperature increase scenario. Elevated [CO</w:t>
+        <w:t xml:space="preserve">. The standalone strategy of using a late-maturing cultivar under a 2°C temperature increase yielded median yields comparable to the historical baseline. This practice increased yields in 61% of the 4,651 fields simulated, particularly those located in the central-north region (Figure S5). Early sowing increased yields in 22% of the fields, mostly located in the Northeast region, compared to the 2°C temperature increase scenario. </w:t>
+      </w:r>
+      <w:ins w:id="200" w:author="Claude" w:date="2026-06-09T00:00:00Z">
+        <w:r>
+          <w:rPr>
+            <w:rFonts w:ascii="Times New Roman" w:hAnsi="Times New Roman" w:cs="Times New Roman"/>
+            <w:color w:val="000000" w:themeColor="text1"/>
+            <w:sz w:val="24"/>
+            <w:szCs w:val="24"/>
+          </w:rPr>
+          <w:t xml:space="preserve"> The combined strategy extended the mean seed-filling period by 13 days compared to the +2°C scenario without adaptation (57 vs. 44 days), with standalone maturity group shift and early sowing extending it by 4 and 8 days, respectively.</w:t>
+        </w:r>
+      </w:ins>
+      <w:r>
+        <w:rPr>
+          <w:rFonts w:ascii="Times New Roman" w:hAnsi="Times New Roman" w:cs="Times New Roman"/>
+          <w:sz w:val="24"/>
+          <w:szCs w:val="24"/>
+        </w:rPr>
+        <w:t xml:space="preserve">Elevated [CO</w:t>
       </w:r>
       <w:r>
         <w:rPr>

</xml_diff>